<commit_message>
Before adding {DataContract] attribute
</commit_message>
<xml_diff>
--- a/Samples/TestThemeCreate.docx
+++ b/Samples/TestThemeCreate.docx
@@ -46,6 +46,112 @@
         <a:srgbClr val="96607D"/>
       </a:folHlink>
     </a:clrScheme>
+    <a:fontScheme name="Office">
+      <a:majorFont>
+        <a:latin typeface="Aptos Display" panose="02110004020202020204" charset="-18"/>
+        <a:ea/>
+        <a:cs/>
+        <a:font script="Jpan" typeface="游ゴシック Light"/>
+        <a:font script="Hang" typeface="맑은 고딕"/>
+        <a:font script="Hans" typeface="等线 Light"/>
+        <a:font script="Hant" typeface="新細明體"/>
+        <a:font script="Arab" typeface="Times New Roman"/>
+        <a:font script="Hebr" typeface="Times New Roman"/>
+        <a:font script="Thai" typeface="Angsana New"/>
+        <a:font script="Ethi" typeface="Nyala"/>
+        <a:font script="Beng" typeface="Vrinda"/>
+        <a:font script="Gujr" typeface="Shruti"/>
+        <a:font script="Khmr" typeface="MoolBoran"/>
+        <a:font script="Knda" typeface="Tunga"/>
+        <a:font script="Guru" typeface="Raavi"/>
+        <a:font script="Cans" typeface="Euphemia"/>
+        <a:font script="Cher" typeface="Plantagenet Cherokee"/>
+        <a:font script="Yiii" typeface="Microsoft Yi Baiti"/>
+        <a:font script="Tibt" typeface="Microsoft Himalaya"/>
+        <a:font script="Thaa" typeface="MV Boli"/>
+        <a:font script="Deva" typeface="Mangal"/>
+        <a:font script="Telu" typeface="Gautami"/>
+        <a:font script="Taml" typeface="Latha"/>
+        <a:font script="Syrc" typeface="Estrangelo Edessa"/>
+        <a:font script="Orya" typeface="Kalinga"/>
+        <a:font script="Mlym" typeface="Kartika"/>
+        <a:font script="Laoo" typeface="DokChampa"/>
+        <a:font script="Sinh" typeface="Iskoola Pota"/>
+        <a:font script="Mong" typeface="Mongolian Baiti"/>
+        <a:font script="Viet" typeface="Times New Roman"/>
+        <a:font script="Uigh" typeface="Microsoft Uighur"/>
+        <a:font script="Geor" typeface="Sylfaen"/>
+        <a:font script="Armn" typeface="Arial"/>
+        <a:font script="Bugi" typeface="Leelawadee UI"/>
+        <a:font script="Bopo" typeface="Microsoft JhengHei"/>
+        <a:font script="Java" typeface="Javanese Text"/>
+        <a:font script="Lisu" typeface="Segoe UI"/>
+        <a:font script="Mymr" typeface="Myanmar Text"/>
+        <a:font script="Nkoo" typeface="Ebrima"/>
+        <a:font script="Olck" typeface="Nirmala UI"/>
+        <a:font script="Osma" typeface="Ebrima"/>
+        <a:font script="Phag" typeface="Phagspa"/>
+        <a:font script="Syrn" typeface="Estrangelo Edessa"/>
+        <a:font script="Syrj" typeface="Estrangelo Edessa"/>
+        <a:font script="Syre" typeface="Estrangelo Edessa"/>
+        <a:font script="Sora" typeface="Nirmala UI"/>
+        <a:font script="Tale" typeface="Microsoft Tai Le"/>
+        <a:font script="Talu" typeface="Microsoft New Tai Lue"/>
+        <a:font script="Tfng" typeface="Ebrima"/>
+      </a:majorFont>
+      <a:minorFont>
+        <a:latin typeface="Aptos Display" panose="02110004020202020204"/>
+        <a:ea/>
+        <a:cs/>
+        <a:font script="Jpan" typeface="游明朝"/>
+        <a:font script="Hang" typeface="맑은 고딕"/>
+        <a:font script="Hans" typeface="等线"/>
+        <a:font script="Hant" typeface="新細明體"/>
+        <a:font script="Arab" typeface="Arial"/>
+        <a:font script="Hebr" typeface="Arial"/>
+        <a:font script="Thai" typeface="Cordia New"/>
+        <a:font script="Ethi" typeface="Nyala"/>
+        <a:font script="Beng" typeface="Vrinda"/>
+        <a:font script="Gujr" typeface="Shruti"/>
+        <a:font script="Khmr" typeface="DaunPenh"/>
+        <a:font script="Knda" typeface="Tunga"/>
+        <a:font script="Guru" typeface="Raavi"/>
+        <a:font script="Cans" typeface="Euphemia"/>
+        <a:font script="Cher" typeface="Plantagenet Cherokee"/>
+        <a:font script="Yiii" typeface="Microsoft Yi Baiti"/>
+        <a:font script="Tibt" typeface="Microsoft Himalaya"/>
+        <a:font script="Thaa" typeface="MV Boli"/>
+        <a:font script="Deva" typeface="Mangal"/>
+        <a:font script="Telu" typeface="Gautami"/>
+        <a:font script="Taml" typeface="Latha"/>
+        <a:font script="Syrc" typeface="Estrangelo Edessa"/>
+        <a:font script="Orya" typeface="Kalinga"/>
+        <a:font script="Mlym" typeface="Kartika"/>
+        <a:font script="Laoo" typeface="DokChampa"/>
+        <a:font script="Sinh" typeface="Iskoola Pota"/>
+        <a:font script="Mong" typeface="Mongolian Baiti"/>
+        <a:font script="Viet" typeface="Arial"/>
+        <a:font script="Uigh" typeface="Microsoft Uighur"/>
+        <a:font script="Geor" typeface="Sylfaen"/>
+        <a:font script="Armn" typeface="Arial"/>
+        <a:font script="Bugi" typeface="Leelawadee UI"/>
+        <a:font script="Bopo" typeface="Microsoft JhengHei"/>
+        <a:font script="Java" typeface="Javanese Text"/>
+        <a:font script="Lisu" typeface="Segoe UI"/>
+        <a:font script="Mymr" typeface="Myanmar Text"/>
+        <a:font script="Nkoo" typeface="Ebrima"/>
+        <a:font script="Olck" typeface="Nirmala UI"/>
+        <a:font script="Osma" typeface="Ebrima"/>
+        <a:font script="Phag" typeface="Phagspa"/>
+        <a:font script="Syrn" typeface="Estrangelo Edessa"/>
+        <a:font script="Syrj" typeface="Estrangelo Edessa"/>
+        <a:font script="Syre" typeface="Estrangelo Edessa"/>
+        <a:font script="Sora" typeface="Nirmala UI"/>
+        <a:font script="Tale" typeface="Microsoft Tai Le"/>
+        <a:font script="Talu" typeface="Microsoft New Tai Lue"/>
+        <a:font script="Tfng" typeface="Ebrima"/>
+      </a:minorFont>
+    </a:fontScheme>
   </a:themeElements>
 </a:theme>
 </file>
</xml_diff>

<commit_message>
Tint and Shade color components implemented
</commit_message>
<xml_diff>
--- a/Samples/TestThemeCreate.docx
+++ b/Samples/TestThemeCreate.docx
@@ -51,11 +51,105 @@
         <a:latin typeface="Aptos Display" panose="02110004020202020204" charset="-18"/>
         <a:ea typeface="Aptos Display" panose="02110004020202020204" charset="-128"/>
         <a:cs typeface="Aptos Display" panose="02110004020202020204" charset="-79"/>
+        <a:font script="Jpan" typeface="游ゴシック Light"/>
+        <a:font script="Hang" typeface="맑은 고딕"/>
+        <a:font script="Hans" typeface="等线 Light"/>
+        <a:font script="Hant" typeface="新細明體"/>
+        <a:font script="Arab" typeface="Times New Roman"/>
+        <a:font script="Hebr" typeface="Times New Roman"/>
+        <a:font script="Thai" typeface="Angsana New"/>
+        <a:font script="Ethi" typeface="Nyala"/>
+        <a:font script="Beng" typeface="Vrinda"/>
+        <a:font script="Gujr" typeface="Shruti"/>
+        <a:font script="Khmr" typeface="MoolBoran"/>
+        <a:font script="Knda" typeface="Tunga"/>
+        <a:font script="Guru" typeface="Raavi"/>
+        <a:font script="Cans" typeface="Euphemia"/>
+        <a:font script="Cher" typeface="Plantagenet Cherokee"/>
+        <a:font script="Yiii" typeface="Microsoft Yi Baiti"/>
+        <a:font script="Tibt" typeface="Microsoft Himalaya"/>
+        <a:font script="Thaa" typeface="MV Boli"/>
+        <a:font script="Deva" typeface="Mangal"/>
+        <a:font script="Telu" typeface="Gautami"/>
+        <a:font script="Taml" typeface="Latha"/>
+        <a:font script="Syrc" typeface="Estrangelo Edessa"/>
+        <a:font script="Orya" typeface="Kalinga"/>
+        <a:font script="Mlym" typeface="Kartika"/>
+        <a:font script="Laoo" typeface="DokChampa"/>
+        <a:font script="Sinh" typeface="Iskoola Pota"/>
+        <a:font script="Mong" typeface="Mongolian Baiti"/>
+        <a:font script="Viet" typeface="Times New Roman"/>
+        <a:font script="Uigh" typeface="Microsoft Uighur"/>
+        <a:font script="Geor" typeface="Sylfaen"/>
+        <a:font script="Armn" typeface="Arial"/>
+        <a:font script="Bugi" typeface="Leelawadee UI"/>
+        <a:font script="Bopo" typeface="Microsoft JhengHei"/>
+        <a:font script="Java" typeface="Javanese Text"/>
+        <a:font script="Lisu" typeface="Segoe UI"/>
+        <a:font script="Mymr" typeface="Myanmar Text"/>
+        <a:font script="Nkoo" typeface="Ebrima"/>
+        <a:font script="Olck" typeface="Nirmala UI"/>
+        <a:font script="Osma" typeface="Ebrima"/>
+        <a:font script="Phag" typeface="Phagspa"/>
+        <a:font script="Syrn" typeface="Estrangelo Edessa"/>
+        <a:font script="Syrj" typeface="Estrangelo Edessa"/>
+        <a:font script="Syre" typeface="Estrangelo Edessa"/>
+        <a:font script="Sora" typeface="Nirmala UI"/>
+        <a:font script="Tale" typeface="Microsoft Tai Le"/>
+        <a:font script="Talu" typeface="Microsoft New Tai Lue"/>
+        <a:font script="Tfng" typeface="Ebrima"/>
       </a:majorFont>
       <a:minorFont>
         <a:latin typeface="Aptos Display" panose="02110004020202020204" charset="-18"/>
         <a:ea typeface="Aptos Display" panose="02110004020202020204" charset="-128"/>
         <a:cs typeface="Aptos Display" panose="02110004020202020204" charset="-79"/>
+        <a:font script="Jpan" typeface="游明朝"/>
+        <a:font script="Hang" typeface="맑은 고딕"/>
+        <a:font script="Hans" typeface="等线"/>
+        <a:font script="Hant" typeface="新細明體"/>
+        <a:font script="Arab" typeface="Arial"/>
+        <a:font script="Hebr" typeface="Arial"/>
+        <a:font script="Thai" typeface="Cordia New"/>
+        <a:font script="Ethi" typeface="Nyala"/>
+        <a:font script="Beng" typeface="Vrinda"/>
+        <a:font script="Gujr" typeface="Shruti"/>
+        <a:font script="Khmr" typeface="DaunPenh"/>
+        <a:font script="Knda" typeface="Tunga"/>
+        <a:font script="Guru" typeface="Raavi"/>
+        <a:font script="Cans" typeface="Euphemia"/>
+        <a:font script="Cher" typeface="Plantagenet Cherokee"/>
+        <a:font script="Yiii" typeface="Microsoft Yi Baiti"/>
+        <a:font script="Tibt" typeface="Microsoft Himalaya"/>
+        <a:font script="Thaa" typeface="MV Boli"/>
+        <a:font script="Deva" typeface="Mangal"/>
+        <a:font script="Telu" typeface="Gautami"/>
+        <a:font script="Taml" typeface="Latha"/>
+        <a:font script="Syrc" typeface="Estrangelo Edessa"/>
+        <a:font script="Orya" typeface="Kalinga"/>
+        <a:font script="Mlym" typeface="Kartika"/>
+        <a:font script="Laoo" typeface="DokChampa"/>
+        <a:font script="Sinh" typeface="Iskoola Pota"/>
+        <a:font script="Mong" typeface="Mongolian Baiti"/>
+        <a:font script="Viet" typeface="Arial"/>
+        <a:font script="Uigh" typeface="Microsoft Uighur"/>
+        <a:font script="Geor" typeface="Sylfaen"/>
+        <a:font script="Armn" typeface="Arial"/>
+        <a:font script="Bugi" typeface="Leelawadee UI"/>
+        <a:font script="Bopo" typeface="Microsoft JhengHei"/>
+        <a:font script="Java" typeface="Javanese Text"/>
+        <a:font script="Lisu" typeface="Segoe UI"/>
+        <a:font script="Mymr" typeface="Myanmar Text"/>
+        <a:font script="Nkoo" typeface="Ebrima"/>
+        <a:font script="Olck" typeface="Nirmala UI"/>
+        <a:font script="Osma" typeface="Ebrima"/>
+        <a:font script="Phag" typeface="Phagspa"/>
+        <a:font script="Syrn" typeface="Estrangelo Edessa"/>
+        <a:font script="Syrj" typeface="Estrangelo Edessa"/>
+        <a:font script="Syre" typeface="Estrangelo Edessa"/>
+        <a:font script="Sora" typeface="Nirmala UI"/>
+        <a:font script="Tale" typeface="Microsoft Tai Le"/>
+        <a:font script="Talu" typeface="Microsoft New Tai Lue"/>
+        <a:font script="Tfng" typeface="Ebrima"/>
       </a:minorFont>
     </a:fontScheme>
   </a:themeElements>

</xml_diff>